<commit_message>
fix(paper): replace ASCII diagrams with high-res figures and audit names/affiliations
- Generate publication-grade 300+ DPI vector figures for Figures 1, 2, and 3
- Fix Figure 2 architecture: correct policy denial branch, fix audit URL localhost port, and separate SourceBadge provenance marker from consent flow
- Audit and standardize names and affiliations:
  * Supervisor: Prof. Dr. Malik Nasir Ali Al-Jabri (Supervisor) / أ.د. مالك ناصر علي الجبري (مشرفًا أكاديميًا)
  * Institution: Faculty of Engineering and Information Technology, Emirates International University
  * Authors: Mubarak Walid Al-Hamadi, Yasin Abd Al-Aziz Al-Khalqi, Muhammad Saif Ali Al-Heimi
- Update PAPER_EN.md, PAPER_AR.md, build_papers.py, and build_proposals.py
- Rebuild DOCX and PDF artifacts for papers and proposals
</commit_message>
<xml_diff>
--- a/MCP_Apps_Trust_Boundaries_Paper_AR.docx
+++ b/MCP_Apps_Trust_Boundaries_Paper_AR.docx
@@ -55,7 +55,7 @@
           <w:color w:val="212529"/>
           <w:sz w:val="21"/>
         </w:rPr>
-        <w:t xml:space="preserve"> أ.د.ب. مالك ناصر علي الجبري، مبارك وليد الحمادي، ياسين عبد العزيز الخالقي، محمد سيف علي الحيمي</w:t>
+        <w:t xml:space="preserve"> أ.د. مالك ناصر علي الجبري (مشرفًا أكاديميًا)، مبارك وليد الحمادي، ياسين عبد العزيز الخالقي، محمد سيف علي الحيمي (باحثون)</w:t>
       </w:r>
     </w:p>
     <w:p xml:lang="ar">
@@ -81,7 +81,7 @@
           <w:color w:val="212529"/>
           <w:sz w:val="21"/>
         </w:rPr>
-        <w:t xml:space="preserve"> كلية الحاسوب وتكنولوجيا المعلومات، الجامعة الإماراتية الدولية، صنعاء</w:t>
+        <w:t xml:space="preserve"> كلية الهندسة وتكنولوجيا المعلومات، الجامعة الإماراتية الدولية (EIU)، صنعاء، الجمهورية اليمنية</w:t>
       </w:r>
     </w:p>
     <w:p xml:lang="ar">
@@ -817,103 +817,47 @@
         <w:t xml:space="preserve"> يطلب موافقة المستخدم أو يطبق سياسات محلية، ولكنها لا تفرض سلوكًا افتراضيًا صارمًا. وبالتالي، فإن المضيف الملتزم بالمواصفة القياسية الأساسية (Baseline)—الذي يطبق العزل التقني دون إضافة طبقة حوكمة—يقوم بتنفيذ هذه الطلبات تلقائيًا فور وصولها، مما يُشكل ثغرة هيكلية لاستغلال الصلاحيات.</w:t>
       </w:r>
     </w:p>
-    <w:tbl>
-      <w:tblPr>
-        <w:tblW w:type="auto" w:w="0"/>
+    <w:p>
+      <w:pPr>
+        <w:keepNext/>
+        <w:spacing w:before="160" w:after="40"/>
         <w:jc w:val="center"/>
-        <w:tblLook w:firstColumn="1" w:firstRow="1" w:lastColumn="0" w:lastRow="0" w:noHBand="0" w:noVBand="1" w:val="04A0"/>
-      </w:tblPr>
-      <w:tblGrid>
-        <w:gridCol w:w="9749"/>
-      </w:tblGrid>
-      <w:tr>
-        <w:tc>
-          <w:tcPr>
-            <w:tcW w:type="dxa" w:w="9749"/>
-            <w:shd w:fill="F4F6F9"/>
-            <w:tcMar>
-              <w:top w:w="80" w:type="dxa"/>
-              <w:bottom w:w="80" w:type="dxa"/>
-              <w:left w:w="120" w:type="dxa"/>
-              <w:right w:w="120" w:type="dxa"/>
-            </w:tcMar>
-            <w:tcBorders>
-              <w:top w:val="single" w:sz="4" w:space="0" w:color="D0D5DD"/>
-              <w:left w:val="single" w:sz="4" w:space="0" w:color="D0D5DD"/>
-              <w:bottom w:val="single" w:sz="4" w:space="0" w:color="D0D5DD"/>
-              <w:right w:val="single" w:sz="18" w:space="0" w:color="1F497D"/>
-            </w:tcBorders>
-          </w:tcPr>
-          <w:p>
-            <w:pPr>
-              <w:spacing w:before="40" w:after="40" w:line="200" w:lineRule="exact"/>
-            </w:pPr>
-            <w:r>
-              <w:rPr>
-                <w:rFonts w:ascii="Consolas" w:hAnsi="Consolas"/>
-                <w:color w:val="1E293B"/>
-                <w:sz w:val="16"/>
-              </w:rPr>
-              <w:t>+-------------------------------------------------------------------------+</w:t>
-              <w:br/>
-              <w:t>|                               تطبيق المضيف                              |</w:t>
-              <w:br/>
-              <w:t>|                                                                         |</w:t>
-              <w:br/>
-              <w:t>|  [ واجهة المحادثة ]       [ سياق النموذج اللغوي ]     [ متصفح النظام ]  |</w:t>
-              <w:br/>
-              <w:t>|           ^                         ^                        ^          |</w:t>
-              <w:br/>
-              <w:t>|           |                         |                        |          |</w:t>
-              <w:br/>
-              <w:t>|  ==================== طبقة سياسة المضيف المقترحة ===================   |</w:t>
-              <w:br/>
-              <w:t>|   (بوابة الموافقة، التحقق من المخطط، تحديد الحجم، شارة المصدر)          |</w:t>
-              <w:br/>
-              <w:t>|  ====================================================================   |</w:t>
-              <w:br/>
-              <w:t>|           | (ui/message)            | (ui/context)           | (open-link)</w:t>
-              <w:br/>
-              <w:t>|           +-------------------------+------------------------+          |</w:t>
-              <w:br/>
-              <w:t>|                                     |                                   |</w:t>
-              <w:br/>
-              <w:t>|                        [ جسر التطبيق AppBridge ]                        |</w:t>
-              <w:br/>
-              <w:t>|                                     |                                   |</w:t>
-              <w:br/>
-              <w:t>|  +----------------------------------+--------------------------------+  |</w:t>
-              <w:br/>
-              <w:t>|  |                 عزل المتصفح (Iframe Sandbox Proxy)                |  |</w:t>
-              <w:br/>
-              <w:t>|  |                                                                   |  |</w:t>
-              <w:br/>
-              <w:t>|  |   +-----------------------------------------------------------+   |  |</w:t>
-              <w:br/>
-              <w:t>|  |   |           واجهة تطبيق MCP غير الموثوقة (مهاجم)            |   |  |</w:t>
-              <w:br/>
-              <w:t>|  |   |                                                           |   |  |</w:t>
-              <w:br/>
-              <w:t>|  |   |  [ هجوم 1: اتصال شبكي مباشر ]   ---&gt; محجوب بـ CSP         |   |  |</w:t>
-              <w:br/>
-              <w:t>|  |   |  [ هجوم 2: استدعاء أداة مخفية ] ---&gt; محجوب بالمواصفة      |   |  |</w:t>
-              <w:br/>
-              <w:t>|  |   |  [ هجوم 3: تسريب عبر الروابط ]  ---&gt; ؟ فجوة سياسة المضيف ؟|   |  |</w:t>
-              <w:br/>
-              <w:t>|  |   |  [ هجوم 4: حقن رسائل المحادثة ] ---&gt; ؟ فجوة سياسة المضيف ؟|   |  |</w:t>
-              <w:br/>
-              <w:t>|  |   |  [ هجوم 5: تسميم سياق النموذج ] ---&gt; ؟ فجوة سياسة المضيف ؟|   |  |</w:t>
-              <w:br/>
-              <w:t>|  |   +-----------------------------------------------------------+   |  |</w:t>
-              <w:br/>
-              <w:t>|  +-------------------------------------------------------------------+  |</w:t>
-              <w:br/>
-              <w:t>+-------------------------------------------------------------------------+</w:t>
-            </w:r>
-          </w:p>
-        </w:tc>
-      </w:tr>
-    </w:tbl>
+      </w:pPr>
+      <w:r>
+        <w:drawing>
+          <wp:inline xmlns:a="http://schemas.openxmlformats.org/drawingml/2006/main" xmlns:pic="http://schemas.openxmlformats.org/drawingml/2006/picture">
+            <wp:extent cx="6217920" cy="3799840"/>
+            <wp:docPr id="1" name="Picture 1"/>
+            <wp:cNvGraphicFramePr>
+              <a:graphicFrameLocks noChangeAspect="1"/>
+            </wp:cNvGraphicFramePr>
+            <a:graphic>
+              <a:graphicData uri="http://schemas.openxmlformats.org/drawingml/2006/picture">
+                <pic:pic>
+                  <pic:nvPicPr>
+                    <pic:cNvPr id="0" name="fig1_trust_boundary.png"/>
+                    <pic:cNvPicPr/>
+                  </pic:nvPicPr>
+                  <pic:blipFill>
+                    <a:blip r:embed="rId11"/>
+                    <a:stretch>
+                      <a:fillRect/>
+                    </a:stretch>
+                  </pic:blipFill>
+                  <pic:spPr>
+                    <a:xfrm>
+                      <a:off x="0" y="0"/>
+                      <a:ext cx="6217920" cy="3799840"/>
+                    </a:xfrm>
+                    <a:prstGeom prst="rect"/>
+                  </pic:spPr>
+                </pic:pic>
+              </a:graphicData>
+            </a:graphic>
+          </wp:inline>
+        </w:drawing>
+      </w:r>
+    </w:p>
     <w:p xml:lang="ar">
       <w:pPr w:bidi="true">
         <w:spacing w:before="60" w:after="160"/>
@@ -1805,99 +1749,47 @@
         <w:t>) داخل المضيف، وتطبق القواعد الأربع التالية:</w:t>
       </w:r>
     </w:p>
-    <w:tbl>
-      <w:tblPr>
-        <w:tblW w:type="auto" w:w="0"/>
+    <w:p>
+      <w:pPr>
+        <w:keepNext/>
+        <w:spacing w:before="160" w:after="40"/>
         <w:jc w:val="center"/>
-        <w:tblLook w:firstColumn="1" w:firstRow="1" w:lastColumn="0" w:lastRow="0" w:noHBand="0" w:noVBand="1" w:val="04A0"/>
-      </w:tblPr>
-      <w:tblGrid>
-        <w:gridCol w:w="9749"/>
-      </w:tblGrid>
-      <w:tr>
-        <w:tc>
-          <w:tcPr>
-            <w:tcW w:type="dxa" w:w="9749"/>
-            <w:shd w:fill="F4F6F9"/>
-            <w:tcMar>
-              <w:top w:w="80" w:type="dxa"/>
-              <w:bottom w:w="80" w:type="dxa"/>
-              <w:left w:w="120" w:type="dxa"/>
-              <w:right w:w="120" w:type="dxa"/>
-            </w:tcMar>
-            <w:tcBorders>
-              <w:top w:val="single" w:sz="4" w:space="0" w:color="D0D5DD"/>
-              <w:left w:val="single" w:sz="4" w:space="0" w:color="D0D5DD"/>
-              <w:bottom w:val="single" w:sz="4" w:space="0" w:color="D0D5DD"/>
-              <w:right w:val="single" w:sz="18" w:space="0" w:color="1F497D"/>
-            </w:tcBorders>
-          </w:tcPr>
-          <w:p>
-            <w:pPr>
-              <w:spacing w:before="40" w:after="40" w:line="200" w:lineRule="exact"/>
-            </w:pPr>
-            <w:r>
-              <w:rPr>
-                <w:rFonts w:ascii="Consolas" w:hAnsi="Consolas"/>
-                <w:color w:val="1E293B"/>
-                <w:sz w:val="16"/>
-              </w:rPr>
-              <w:t>+---------------------------------------------------------------------------------+</w:t>
-              <w:br/>
-              <w:t>|                         محرك سياسة المضيف المقترح                               |</w:t>
-              <w:br/>
-              <w:t>|                                                                                 |</w:t>
-              <w:br/>
-              <w:t>|   1. التحقق من مخطط الروابط                 2. ضبط الرسائل وسياق النموذج        |</w:t>
-              <w:br/>
-              <w:t>|   +--------------------------+              +-------------------------------+   |</w:t>
-              <w:br/>
-              <w:t>|   | مخطط الرابط: http/https  |              | الحجم الأقصى: &lt;= 4 كيلوبايت   |   |</w:t>
-              <w:br/>
-              <w:t>|   | فحص المخطط: نجاح         |              | فحص المحتوى: نجاح             |   |</w:t>
-              <w:br/>
-              <w:t>|   +--------------------------+              +-------------------------------+   |</w:t>
-              <w:br/>
-              <w:t>|                |                                        |                       |</w:t>
-              <w:br/>
-              <w:t>|                v                                        v                       |</w:t>
-              <w:br/>
-              <w:t>|   +-------------------------------------------------------------------------+   |</w:t>
-              <w:br/>
-              <w:t>|   |                       بوابة موافقة المستخدم الصريحة                     |   |</w:t>
-              <w:br/>
-              <w:t>|   |  - الفحص الآلي: autoConsent == "allow" | "deny"                         |   |</w:t>
-              <w:br/>
-              <w:t>|   |  - الواجهة التفاعلية: إطلاق حدث في الـ DOM -&gt; نافذة تأكيد للمستخدم      |   |</w:t>
-              <w:br/>
-              <w:t>|   +-------------------------------------------------------------------------+   |</w:t>
-              <w:br/>
-              <w:t>|                |                                        |                       |</w:t>
-              <w:br/>
-              <w:t>|                +-------------------+--------------------+                       |</w:t>
-              <w:br/>
-              <w:t>|                                    |                                            |</w:t>
-              <w:br/>
-              <w:t>|                                    v                                            |</w:t>
-              <w:br/>
-              <w:t>|   3. علامة حد الثقة المرئية                4. سجل التدقيق المنفصل غير المعطل    |</w:t>
-              <w:br/>
-              <w:t>|   +---------------------------------+      +--------------------------------+   |</w:t>
-              <w:br/>
-              <w:t>|   | مكون SourceBadge المرئي         |      | الوجهة: POST http://:3001/audit|   |</w:t>
-              <w:br/>
-              <w:t>|   | يُعرض إجباريًا أعلى الإطار      |      | المخطط: سجل أحداث PolicyEvent  |   |</w:t>
-              <w:br/>
-              <w:t>|   | تحذير دائم يوضح مصدر الواجهة    |      | العبء الزمني: &lt;= 0.1 مللي ثانية|   |</w:t>
-              <w:br/>
-              <w:t>|   +---------------------------------+      +--------------------------------+   |</w:t>
-              <w:br/>
-              <w:t>+---------------------------------------------------------------------------------+</w:t>
-            </w:r>
-          </w:p>
-        </w:tc>
-      </w:tr>
-    </w:tbl>
+      </w:pPr>
+      <w:r>
+        <w:drawing>
+          <wp:inline xmlns:a="http://schemas.openxmlformats.org/drawingml/2006/main" xmlns:pic="http://schemas.openxmlformats.org/drawingml/2006/picture">
+            <wp:extent cx="6217920" cy="3821430"/>
+            <wp:docPr id="2" name="Picture 2"/>
+            <wp:cNvGraphicFramePr>
+              <a:graphicFrameLocks noChangeAspect="1"/>
+            </wp:cNvGraphicFramePr>
+            <a:graphic>
+              <a:graphicData uri="http://schemas.openxmlformats.org/drawingml/2006/picture">
+                <pic:pic>
+                  <pic:nvPicPr>
+                    <pic:cNvPr id="0" name="fig2_policy_engine.png"/>
+                    <pic:cNvPicPr/>
+                  </pic:nvPicPr>
+                  <pic:blipFill>
+                    <a:blip r:embed="rId12"/>
+                    <a:stretch>
+                      <a:fillRect/>
+                    </a:stretch>
+                  </pic:blipFill>
+                  <pic:spPr>
+                    <a:xfrm>
+                      <a:off x="0" y="0"/>
+                      <a:ext cx="6217920" cy="3821430"/>
+                    </a:xfrm>
+                    <a:prstGeom prst="rect"/>
+                  </pic:spPr>
+                </pic:pic>
+              </a:graphicData>
+            </a:graphic>
+          </wp:inline>
+        </w:drawing>
+      </w:r>
+    </w:p>
     <w:p xml:lang="ar">
       <w:pPr w:bidi="true">
         <w:spacing w:before="60" w:after="160"/>
@@ -2597,6 +2489,63 @@
           <w:sz w:val="20"/>
         </w:rPr>
         <w:t xml:space="preserve"> ضرورية للسماح بعناصر النماذج التفاعلية المشروعة داخل التطبيقات (كحقول البحث وأزرار الإرسال) دون كسر تفاعل الواجهة.</w:t>
+      </w:r>
+    </w:p>
+    <w:p>
+      <w:pPr>
+        <w:keepNext/>
+        <w:spacing w:before="160" w:after="40"/>
+        <w:jc w:val="center"/>
+      </w:pPr>
+      <w:r>
+        <w:drawing>
+          <wp:inline xmlns:a="http://schemas.openxmlformats.org/drawingml/2006/main" xmlns:pic="http://schemas.openxmlformats.org/drawingml/2006/picture">
+            <wp:extent cx="6217920" cy="3799840"/>
+            <wp:docPr id="3" name="Picture 3"/>
+            <wp:cNvGraphicFramePr>
+              <a:graphicFrameLocks noChangeAspect="1"/>
+            </wp:cNvGraphicFramePr>
+            <a:graphic>
+              <a:graphicData uri="http://schemas.openxmlformats.org/drawingml/2006/picture">
+                <pic:pic>
+                  <pic:nvPicPr>
+                    <pic:cNvPr id="0" name="fig3_topology.png"/>
+                    <pic:cNvPicPr/>
+                  </pic:nvPicPr>
+                  <pic:blipFill>
+                    <a:blip r:embed="rId13"/>
+                    <a:stretch>
+                      <a:fillRect/>
+                    </a:stretch>
+                  </pic:blipFill>
+                  <pic:spPr>
+                    <a:xfrm>
+                      <a:off x="0" y="0"/>
+                      <a:ext cx="6217920" cy="3799840"/>
+                    </a:xfrm>
+                    <a:prstGeom prst="rect"/>
+                  </pic:spPr>
+                </pic:pic>
+              </a:graphicData>
+            </a:graphic>
+          </wp:inline>
+        </w:drawing>
+      </w:r>
+    </w:p>
+    <w:p xml:lang="ar">
+      <w:pPr w:bidi="true">
+        <w:spacing w:before="60" w:after="160"/>
+        <w:jc w:val="center"/>
+      </w:pPr>
+      <w:r>
+        <w:rPr>
+          <w:rFonts w:ascii="Noto Naskh Arabic" w:hAnsi="Noto Naskh Arabic"/>
+          <w:b w:val="0"/>
+          <w:i/>
+          <w:color w:val="475569"/>
+          <w:sz w:val="19"/>
+        </w:rPr>
+        <w:t>الشكل 3: طوبولوجيا بيئة الاختبار المعملية عبر أربعة منافذ محلية معزولة (:8090، :8091، :3001، :9999).</w:t>
       </w:r>
     </w:p>
     <w:p xml:lang="ar">
@@ -9868,7 +9817,7 @@
         <w:color w:val="787878"/>
         <w:sz w:val="17"/>
       </w:rPr>
-      <w:t>الجامعة الإماراتية الدولية | كلية الحاسوب وتكنولوجيا المعلومات — ورقة بحثية محكمة</w:t>
+      <w:t>الجامعة الإماراتية الدولية | كلية الهندسة وتكنولوجيا المعلومات — ورقة بحثية محكمة</w:t>
     </w:r>
   </w:p>
 </w:hdr>

</xml_diff>